<commit_message>
Close Disruption-mirror layout gap + printable quick-reference card
- Found the Disruption-vs-Disruption (Outmanoeuvre) mirror at EC pp.36-38
  (the book places each disposition's mirror FIRST in its block): Layout A
  diagonal, B diagonal (stepped), C vertical. disruption.yaml now has all 5
  matchups verified page-by-page; regenerated Sisters-Battle-Plan.docx.
- docs/Sisters-Quick-Reference.docx (tools/gen_sisters_qref_docx.py): a
  compact, print-friendly tabletop card -- mission-by-opponent table,
  deploy, per-shooting-phase softening sequence, target priority, per-round
  checklist, and the glass-cannon don'ts.

Co-Authored-By: Claude Opus 4.8 (1M context) <noreply@anthropic.com>
</commit_message>
<xml_diff>
--- a/docs/Sisters-Battle-Plan.docx
+++ b/docs/Sisters-Battle-Plan.docx
@@ -1000,7 +1000,7 @@
         <w:t xml:space="preserve">Layout A: </w:t>
       </w:r>
       <w:r>
-        <w:t>unread — symmetric mirror; A is diagonal in every other matchup -&gt; plan diagonal, CONFIRM from EC</w:t>
+        <w:t>diagonal — opposite-corner castles, big diagonal NML; long approach</w:t>
       </w:r>
     </w:p>
     <w:p>
@@ -1015,7 +1015,7 @@
         <w:t xml:space="preserve">Layout B: </w:t>
       </w:r>
       <w:r>
-        <w:t>unread — confirm from EC</w:t>
+        <w:t>diagonal — stepped diagonal divider; red upper-left / blue lower-right</w:t>
       </w:r>
     </w:p>
     <w:p>
@@ -1030,7 +1030,7 @@
         <w:t xml:space="preserve">Layout C: </w:t>
       </w:r>
       <w:r>
-        <w:t>unread — confirm from EC</w:t>
+        <w:t>vertical — red-left 14" / blue-right 14" bands; central objectives mid</w:t>
       </w:r>
     </w:p>
     <w:p>

</xml_diff>

<commit_message>
Fix misleading letter->deployment-type mapping in the battle-plan doc
The 'standing deployment' note hard-coded Diagonal(A)/Vertical(B)/Horizontal(C),
but the layout letter -> deployment type varies by matchup (verified: e.g. vs
Purge C is vertical, vs T&H C is horizontal). Decoupled the advice from the
letters; noted only that Layout A is diagonal in every Disruption matchup.

Co-Authored-By: Claude Opus 4.8 (1M context) <noreply@anthropic.com>
</commit_message>
<xml_diff>
--- a/docs/Sisters-Battle-Plan.docx
+++ b/docs/Sisters-Battle-Plan.docx
@@ -802,7 +802,7 @@
           <w:b w:val="0"/>
           <w:i w:val="0"/>
         </w:rPr>
-        <w:t>Universal on every layout: 6 objectives (2 home deep in each zone, 2 central in No Man's Land, 2 expansion on the flanks), 16 obscuring terrain areas, centre packed (no turn-1 cross-board LOS). Default your plan to LAYOUT A; B/C notes below.</w:t>
+        <w:t>Universal on every layout: 6 objectives (2 home deep in each zone, 2 central in No Man's Land, 2 expansion on the flanks), 16 obscuring terrain areas, centre packed (no turn-1 cross-board LOS). Layout A is DIAGONAL in every Disruption matchup, so default your plan to a diagonal deployment; B/C vary by matchup (below) — read the letter you're given.</w:t>
       </w:r>
     </w:p>
     <w:p>
@@ -1048,7 +1048,7 @@
         <w:rPr>
           <w:i w:val="0"/>
         </w:rPr>
-        <w:t>castle the Vahl+Paragon hammer + the 2+/4++ MM-Retributor brick central-rear with LOS to the mid; Immolators + Dominions mid-forward (hull-down T1); Sacresants+Canoness hold centre with the anti-Deep-Strike bubble; Battle Sisters screen + sit home/expansion; Zephyrim/Seraphim flanks or Reserve. Diagonal (A) = long approach, angle the hammer across the mid. Horizontal/Dawn-of-War (C) = close, screen harder and value the bubble. Vertical (B) = cover the width with the jump units.</w:t>
+        <w:t>castle the Vahl+Paragon hammer + the 2+/4++ MM-Retributor brick central-rear with LOS to the mid; Immolators + Dominions mid-forward (hull-down T1); Sacresants+Canoness hold centre with the anti-Deep-Strike bubble; Battle Sisters screen + sit home/expansion; Zephyrim/Seraphim flanks or Reserve. Then adapt to the deployment TYPE (the A/B/C letter varies per matchup — see above): DIAGONAL = long approach, angle the hammer across the mid and rush the two central objectives; HORIZONTAL / Dawn-of-War = close, screen harder and value the anti-Deep-Strike bubble; VERTICAL = cover the board width with the jump units.</w:t>
       </w:r>
     </w:p>
     <w:p>

</xml_diff>